<commit_message>
Remove retrieval dates from report references
</commit_message>
<xml_diff>
--- a/report/Project3_Marketing_Analytics_Report.docx
+++ b/report/Project3_Marketing_Analytics_Report.docx
@@ -7718,7 +7718,7 @@
         <w:rPr>
           <w:i w:val="0"/>
         </w:rPr>
-        <w:t xml:space="preserve">. Retrieved October 1, 2026, from </w:t>
+        <w:t xml:space="preserve">. Retrieved from </w:t>
       </w:r>
       <w:hyperlink r:id="rId18">
         <w:r>
@@ -7751,7 +7751,7 @@
         <w:rPr>
           <w:i w:val="0"/>
         </w:rPr>
-        <w:t xml:space="preserve">. Retrieved October 1, 2026, from </w:t>
+        <w:t xml:space="preserve">. Retrieved from </w:t>
       </w:r>
       <w:hyperlink r:id="rId19">
         <w:r>
@@ -7784,7 +7784,7 @@
         <w:rPr>
           <w:i w:val="0"/>
         </w:rPr>
-        <w:t xml:space="preserve">. Retrieved October 1, 2026, from </w:t>
+        <w:t xml:space="preserve">. Retrieved from </w:t>
       </w:r>
       <w:hyperlink r:id="rId20">
         <w:r>
@@ -7817,7 +7817,7 @@
         <w:rPr>
           <w:i w:val="0"/>
         </w:rPr>
-        <w:t xml:space="preserve">. Retrieved October 1, 2026, from </w:t>
+        <w:t xml:space="preserve">. Retrieved from </w:t>
       </w:r>
       <w:hyperlink r:id="rId21">
         <w:r>
@@ -7895,7 +7895,7 @@
         <w:rPr>
           <w:i w:val="0"/>
         </w:rPr>
-        <w:t xml:space="preserve">. Retrieved October 1, 2026, from </w:t>
+        <w:t xml:space="preserve">. Retrieved from </w:t>
       </w:r>
       <w:hyperlink r:id="rId23">
         <w:r>
@@ -7928,7 +7928,7 @@
         <w:rPr>
           <w:i w:val="0"/>
         </w:rPr>
-        <w:t xml:space="preserve">. Retrieved October 1, 2026, from </w:t>
+        <w:t xml:space="preserve">. Retrieved from </w:t>
       </w:r>
       <w:hyperlink r:id="rId24">
         <w:r>
@@ -7961,7 +7961,7 @@
         <w:rPr>
           <w:i w:val="0"/>
         </w:rPr>
-        <w:t xml:space="preserve">. Retrieved October 1, 2026, from </w:t>
+        <w:t xml:space="preserve">. Retrieved from </w:t>
       </w:r>
       <w:hyperlink r:id="rId25">
         <w:r>

</xml_diff>